<commit_message>
docs(submission): embed verified public Figma view link and organized wireframes
</commit_message>
<xml_diff>
--- a/docs/Submission_Checklist_and_Access_Links.docx
+++ b/docs/Submission_Checklist_and_Access_Links.docx
@@ -11,7 +11,7 @@
           <w:rFonts w:ascii="Playfair Display" w:hAnsi="Playfair Display"/>
           <w:b/>
           <w:color w:val="721F3A"/>
-          <w:sz w:val="44"/>
+          <w:sz w:val="40"/>
         </w:rPr>
         <w:t>MagulaPlan (Magula.lk) — Submission Checklist &amp; Access Links</w:t>
       </w:r>
@@ -24,7 +24,7 @@
         <w:rPr>
           <w:rFonts w:ascii="Segoe UI" w:hAnsi="Segoe UI"/>
           <w:color w:val="222222"/>
-          <w:sz w:val="19"/>
+          <w:sz w:val="18"/>
         </w:rPr>
         <w:t xml:space="preserve">In accordance with the </w:t>
       </w:r>
@@ -33,7 +33,7 @@
           <w:rFonts w:ascii="Segoe UI" w:hAnsi="Segoe UI"/>
           <w:b/>
           <w:color w:val="222222"/>
-          <w:sz w:val="19"/>
+          <w:sz w:val="18"/>
         </w:rPr>
         <w:t>CCS2313 Project Management — Additional Submission Guidelines</w:t>
       </w:r>
@@ -41,7 +41,7 @@
         <w:rPr>
           <w:rFonts w:ascii="Segoe UI" w:hAnsi="Segoe UI"/>
           <w:color w:val="222222"/>
-          <w:sz w:val="19"/>
+          <w:sz w:val="18"/>
         </w:rPr>
         <w:t>, this document compiles all required external links, repository access, and verification credentials into a single reference document.</w:t>
       </w:r>
@@ -66,7 +66,7 @@
           <w:rFonts w:ascii="Playfair Display" w:hAnsi="Playfair Display"/>
           <w:b/>
           <w:color w:val="721F3A"/>
-          <w:sz w:val="30"/>
+          <w:sz w:val="28"/>
         </w:rPr>
         <w:t>1. Required Links &amp; Access Configuration</w:t>
       </w:r>
@@ -80,7 +80,7 @@
           <w:rFonts w:ascii="Segoe UI" w:hAnsi="Segoe UI"/>
           <w:b/>
           <w:color w:val="222222"/>
-          <w:sz w:val="24"/>
+          <w:sz w:val="22"/>
         </w:rPr>
         <w:t>1.1 Figma File</w:t>
       </w:r>
@@ -94,7 +94,7 @@
         <w:rPr>
           <w:rFonts w:ascii="Segoe UI" w:hAnsi="Segoe UI"/>
           <w:color w:val="222222"/>
-          <w:sz w:val="19"/>
+          <w:sz w:val="18"/>
         </w:rPr>
       </w:r>
       <w:r>
@@ -102,7 +102,7 @@
           <w:rFonts w:ascii="Segoe UI" w:hAnsi="Segoe UI"/>
           <w:b/>
           <w:color w:val="222222"/>
-          <w:sz w:val="19"/>
+          <w:sz w:val="18"/>
         </w:rPr>
         <w:t>Link:</w:t>
       </w:r>
@@ -110,9 +110,9 @@
         <w:rPr>
           <w:rFonts w:ascii="Segoe UI" w:hAnsi="Segoe UI"/>
           <w:color w:val="222222"/>
-          <w:sz w:val="19"/>
+          <w:sz w:val="18"/>
         </w:rPr>
-        <w:t xml:space="preserve"> `[Insert your public Figma View Link here]`</w:t>
+        <w:t xml:space="preserve"> `https://www.figma.com/design/Mqc0NW1ampHiNFoExxsvo1/MagulaPlan-%E2%80%94-Wedding-Planning-Platform?node-id=0-1&amp;t=6fczkcZM1hWyjF52-1`</w:t>
       </w:r>
     </w:p>
     <w:p>
@@ -124,7 +124,7 @@
         <w:rPr>
           <w:rFonts w:ascii="Segoe UI" w:hAnsi="Segoe UI"/>
           <w:color w:val="222222"/>
-          <w:sz w:val="19"/>
+          <w:sz w:val="18"/>
         </w:rPr>
       </w:r>
       <w:r>
@@ -132,7 +132,7 @@
           <w:rFonts w:ascii="Segoe UI" w:hAnsi="Segoe UI"/>
           <w:b/>
           <w:color w:val="222222"/>
-          <w:sz w:val="19"/>
+          <w:sz w:val="18"/>
         </w:rPr>
         <w:t>Access Level:</w:t>
       </w:r>
@@ -140,16 +140,16 @@
         <w:rPr>
           <w:rFonts w:ascii="Segoe UI" w:hAnsi="Segoe UI"/>
           <w:color w:val="222222"/>
-          <w:sz w:val="19"/>
+          <w:sz w:val="18"/>
         </w:rPr>
-        <w:t xml:space="preserve"> Set to </w:t>
+        <w:t xml:space="preserve"> Configured as </w:t>
       </w:r>
       <w:r>
         <w:rPr>
           <w:rFonts w:ascii="Segoe UI" w:hAnsi="Segoe UI"/>
           <w:b/>
           <w:color w:val="222222"/>
-          <w:sz w:val="19"/>
+          <w:sz w:val="18"/>
         </w:rPr>
         <w:t>"Anyone with the link can view"</w:t>
       </w:r>
@@ -157,9 +157,39 @@
         <w:rPr>
           <w:rFonts w:ascii="Segoe UI" w:hAnsi="Segoe UI"/>
           <w:color w:val="222222"/>
-          <w:sz w:val="19"/>
+          <w:sz w:val="18"/>
         </w:rPr>
         <w:t xml:space="preserve"> (No invite or account needed).</w:t>
+      </w:r>
+    </w:p>
+    <w:p>
+      <w:pPr>
+        <w:pStyle w:val="ListBullet"/>
+        <w:spacing w:after="40"/>
+      </w:pPr>
+      <w:r>
+        <w:rPr>
+          <w:rFonts w:ascii="Segoe UI" w:hAnsi="Segoe UI"/>
+          <w:color w:val="222222"/>
+          <w:sz w:val="18"/>
+        </w:rPr>
+      </w:r>
+      <w:r>
+        <w:rPr>
+          <w:rFonts w:ascii="Segoe UI" w:hAnsi="Segoe UI"/>
+          <w:b/>
+          <w:color w:val="222222"/>
+          <w:sz w:val="18"/>
+        </w:rPr>
+        <w:t>Repository Backups:</w:t>
+      </w:r>
+      <w:r>
+        <w:rPr>
+          <w:rFonts w:ascii="Segoe UI" w:hAnsi="Segoe UI"/>
+          <w:color w:val="222222"/>
+          <w:sz w:val="18"/>
+        </w:rPr>
+        <w:t xml:space="preserve"> Also available in repository at `docs/MagulaPlan Wireframes.pdf` and `docs/MagulaPlan Wireframes(Mobile).pdf`.</w:t>
       </w:r>
     </w:p>
     <w:p>
@@ -182,7 +212,7 @@
           <w:rFonts w:ascii="Segoe UI" w:hAnsi="Segoe UI"/>
           <w:b/>
           <w:color w:val="222222"/>
-          <w:sz w:val="24"/>
+          <w:sz w:val="22"/>
         </w:rPr>
         <w:t>1.2 GitHub Repository</w:t>
       </w:r>
@@ -196,7 +226,7 @@
         <w:rPr>
           <w:rFonts w:ascii="Segoe UI" w:hAnsi="Segoe UI"/>
           <w:color w:val="222222"/>
-          <w:sz w:val="19"/>
+          <w:sz w:val="18"/>
         </w:rPr>
       </w:r>
       <w:r>
@@ -204,7 +234,7 @@
           <w:rFonts w:ascii="Segoe UI" w:hAnsi="Segoe UI"/>
           <w:b/>
           <w:color w:val="222222"/>
-          <w:sz w:val="19"/>
+          <w:sz w:val="18"/>
         </w:rPr>
         <w:t>Link:</w:t>
       </w:r>
@@ -212,7 +242,7 @@
         <w:rPr>
           <w:rFonts w:ascii="Segoe UI" w:hAnsi="Segoe UI"/>
           <w:color w:val="222222"/>
-          <w:sz w:val="19"/>
+          <w:sz w:val="18"/>
         </w:rPr>
         <w:t xml:space="preserve"> `https://github.com/maheensayuru/MagulaPlan`</w:t>
       </w:r>
@@ -226,7 +256,7 @@
         <w:rPr>
           <w:rFonts w:ascii="Segoe UI" w:hAnsi="Segoe UI"/>
           <w:color w:val="222222"/>
-          <w:sz w:val="19"/>
+          <w:sz w:val="18"/>
         </w:rPr>
       </w:r>
       <w:r>
@@ -234,7 +264,7 @@
           <w:rFonts w:ascii="Segoe UI" w:hAnsi="Segoe UI"/>
           <w:b/>
           <w:color w:val="222222"/>
-          <w:sz w:val="19"/>
+          <w:sz w:val="18"/>
         </w:rPr>
         <w:t>Visibility:</w:t>
       </w:r>
@@ -242,7 +272,7 @@
         <w:rPr>
           <w:rFonts w:ascii="Segoe UI" w:hAnsi="Segoe UI"/>
           <w:color w:val="222222"/>
-          <w:sz w:val="19"/>
+          <w:sz w:val="18"/>
         </w:rPr>
         <w:t xml:space="preserve"> Set to </w:t>
       </w:r>
@@ -251,7 +281,7 @@
           <w:rFonts w:ascii="Segoe UI" w:hAnsi="Segoe UI"/>
           <w:b/>
           <w:color w:val="222222"/>
-          <w:sz w:val="19"/>
+          <w:sz w:val="18"/>
         </w:rPr>
         <w:t>Public</w:t>
       </w:r>
@@ -259,7 +289,7 @@
         <w:rPr>
           <w:rFonts w:ascii="Segoe UI" w:hAnsi="Segoe UI"/>
           <w:color w:val="222222"/>
-          <w:sz w:val="19"/>
+          <w:sz w:val="18"/>
         </w:rPr>
         <w:t>.</w:t>
       </w:r>
@@ -273,7 +303,7 @@
         <w:rPr>
           <w:rFonts w:ascii="Segoe UI" w:hAnsi="Segoe UI"/>
           <w:color w:val="222222"/>
-          <w:sz w:val="19"/>
+          <w:sz w:val="18"/>
         </w:rPr>
       </w:r>
       <w:r>
@@ -281,7 +311,7 @@
           <w:rFonts w:ascii="Segoe UI" w:hAnsi="Segoe UI"/>
           <w:b/>
           <w:color w:val="222222"/>
-          <w:sz w:val="19"/>
+          <w:sz w:val="18"/>
         </w:rPr>
         <w:t>Branches:</w:t>
       </w:r>
@@ -289,7 +319,7 @@
         <w:rPr>
           <w:rFonts w:ascii="Segoe UI" w:hAnsi="Segoe UI"/>
           <w:color w:val="222222"/>
-          <w:sz w:val="19"/>
+          <w:sz w:val="18"/>
         </w:rPr>
         <w:t xml:space="preserve"> `main` (Production release), `refactor/ui-redesign-storybook-romance` (Active feature branch).</w:t>
       </w:r>
@@ -303,7 +333,7 @@
         <w:rPr>
           <w:rFonts w:ascii="Segoe UI" w:hAnsi="Segoe UI"/>
           <w:color w:val="222222"/>
-          <w:sz w:val="19"/>
+          <w:sz w:val="18"/>
         </w:rPr>
       </w:r>
       <w:r>
@@ -311,7 +341,7 @@
           <w:rFonts w:ascii="Segoe UI" w:hAnsi="Segoe UI"/>
           <w:b/>
           <w:color w:val="222222"/>
-          <w:sz w:val="19"/>
+          <w:sz w:val="18"/>
         </w:rPr>
         <w:t>Sanitization Audit:</w:t>
       </w:r>
@@ -319,7 +349,7 @@
         <w:rPr>
           <w:rFonts w:ascii="Segoe UI" w:hAnsi="Segoe UI"/>
           <w:color w:val="222222"/>
-          <w:sz w:val="19"/>
+          <w:sz w:val="18"/>
         </w:rPr>
         <w:t xml:space="preserve"> Verified that all `.env` secrets, database root passwords, and private API keys have been removed from tracking.</w:t>
       </w:r>
@@ -344,7 +374,7 @@
           <w:rFonts w:ascii="Segoe UI" w:hAnsi="Segoe UI"/>
           <w:b/>
           <w:color w:val="222222"/>
-          <w:sz w:val="24"/>
+          <w:sz w:val="22"/>
         </w:rPr>
         <w:t>1.3 Jira Project Direct Access</w:t>
       </w:r>
@@ -358,7 +388,7 @@
         <w:rPr>
           <w:rFonts w:ascii="Segoe UI" w:hAnsi="Segoe UI"/>
           <w:color w:val="222222"/>
-          <w:sz w:val="19"/>
+          <w:sz w:val="18"/>
         </w:rPr>
       </w:r>
       <w:r>
@@ -366,7 +396,7 @@
           <w:rFonts w:ascii="Segoe UI" w:hAnsi="Segoe UI"/>
           <w:b/>
           <w:color w:val="222222"/>
-          <w:sz w:val="19"/>
+          <w:sz w:val="18"/>
         </w:rPr>
         <w:t>Project URL:</w:t>
       </w:r>
@@ -374,7 +404,7 @@
         <w:rPr>
           <w:rFonts w:ascii="Segoe UI" w:hAnsi="Segoe UI"/>
           <w:color w:val="222222"/>
-          <w:sz w:val="19"/>
+          <w:sz w:val="18"/>
         </w:rPr>
         <w:t xml:space="preserve"> `https://magulaplan.atlassian.net/jira/software/projects/MAG/boards/1`</w:t>
       </w:r>
@@ -388,7 +418,7 @@
         <w:rPr>
           <w:rFonts w:ascii="Segoe UI" w:hAnsi="Segoe UI"/>
           <w:color w:val="222222"/>
-          <w:sz w:val="19"/>
+          <w:sz w:val="18"/>
         </w:rPr>
       </w:r>
       <w:r>
@@ -396,7 +426,7 @@
           <w:rFonts w:ascii="Segoe UI" w:hAnsi="Segoe UI"/>
           <w:b/>
           <w:color w:val="222222"/>
-          <w:sz w:val="19"/>
+          <w:sz w:val="18"/>
         </w:rPr>
         <w:t>Assigned Evaluator Email:</w:t>
       </w:r>
@@ -404,7 +434,7 @@
         <w:rPr>
           <w:rFonts w:ascii="Segoe UI" w:hAnsi="Segoe UI"/>
           <w:color w:val="222222"/>
-          <w:sz w:val="19"/>
+          <w:sz w:val="18"/>
         </w:rPr>
         <w:t xml:space="preserve"> `chamathkara.k@sltc.ac.lk`</w:t>
       </w:r>
@@ -418,7 +448,7 @@
         <w:rPr>
           <w:rFonts w:ascii="Segoe UI" w:hAnsi="Segoe UI"/>
           <w:color w:val="222222"/>
-          <w:sz w:val="19"/>
+          <w:sz w:val="18"/>
         </w:rPr>
       </w:r>
       <w:r>
@@ -426,7 +456,7 @@
           <w:rFonts w:ascii="Segoe UI" w:hAnsi="Segoe UI"/>
           <w:b/>
           <w:color w:val="222222"/>
-          <w:sz w:val="19"/>
+          <w:sz w:val="18"/>
         </w:rPr>
         <w:t>Access Granted:</w:t>
       </w:r>
@@ -434,7 +464,7 @@
         <w:rPr>
           <w:rFonts w:ascii="Segoe UI" w:hAnsi="Segoe UI"/>
           <w:color w:val="222222"/>
-          <w:sz w:val="19"/>
+          <w:sz w:val="18"/>
         </w:rPr>
         <w:t xml:space="preserve"> Added as </w:t>
       </w:r>
@@ -443,7 +473,7 @@
           <w:rFonts w:ascii="Segoe UI" w:hAnsi="Segoe UI"/>
           <w:b/>
           <w:color w:val="222222"/>
-          <w:sz w:val="19"/>
+          <w:sz w:val="18"/>
         </w:rPr>
         <w:t>Viewer</w:t>
       </w:r>
@@ -451,7 +481,7 @@
         <w:rPr>
           <w:rFonts w:ascii="Segoe UI" w:hAnsi="Segoe UI"/>
           <w:color w:val="222222"/>
-          <w:sz w:val="19"/>
+          <w:sz w:val="18"/>
         </w:rPr>
         <w:t xml:space="preserve"> under Jira Cloud $\rightarrow$ *Project Settings* $\rightarrow$ *People* $\rightarrow$ *Add People*.</w:t>
       </w:r>
@@ -476,7 +506,7 @@
           <w:rFonts w:ascii="Segoe UI" w:hAnsi="Segoe UI"/>
           <w:b/>
           <w:color w:val="222222"/>
-          <w:sz w:val="24"/>
+          <w:sz w:val="22"/>
         </w:rPr>
         <w:t>1.4 Test Cases Documentation</w:t>
       </w:r>
@@ -490,7 +520,7 @@
         <w:rPr>
           <w:rFonts w:ascii="Segoe UI" w:hAnsi="Segoe UI"/>
           <w:color w:val="222222"/>
-          <w:sz w:val="19"/>
+          <w:sz w:val="18"/>
         </w:rPr>
       </w:r>
       <w:r>
@@ -498,7 +528,7 @@
           <w:rFonts w:ascii="Segoe UI" w:hAnsi="Segoe UI"/>
           <w:b/>
           <w:color w:val="222222"/>
-          <w:sz w:val="19"/>
+          <w:sz w:val="18"/>
         </w:rPr>
         <w:t>Source Artifact:</w:t>
       </w:r>
@@ -506,7 +536,7 @@
         <w:rPr>
           <w:rFonts w:ascii="Segoe UI" w:hAnsi="Segoe UI"/>
           <w:color w:val="222222"/>
-          <w:sz w:val="19"/>
+          <w:sz w:val="18"/>
         </w:rPr>
         <w:t xml:space="preserve"> `Magula.lk/docs/MagulaPlan_Test_Cases.md` &amp; `qa/test-summary.md`</w:t>
       </w:r>
@@ -520,7 +550,7 @@
         <w:rPr>
           <w:rFonts w:ascii="Segoe UI" w:hAnsi="Segoe UI"/>
           <w:color w:val="222222"/>
-          <w:sz w:val="19"/>
+          <w:sz w:val="18"/>
         </w:rPr>
       </w:r>
       <w:r>
@@ -528,7 +558,7 @@
           <w:rFonts w:ascii="Segoe UI" w:hAnsi="Segoe UI"/>
           <w:b/>
           <w:color w:val="222222"/>
-          <w:sz w:val="19"/>
+          <w:sz w:val="18"/>
         </w:rPr>
         <w:t>Coverage:</w:t>
       </w:r>
@@ -536,7 +566,7 @@
         <w:rPr>
           <w:rFonts w:ascii="Segoe UI" w:hAnsi="Segoe UI"/>
           <w:color w:val="222222"/>
-          <w:sz w:val="19"/>
+          <w:sz w:val="18"/>
         </w:rPr>
         <w:t xml:space="preserve"> </w:t>
       </w:r>
@@ -545,7 +575,7 @@
           <w:rFonts w:ascii="Segoe UI" w:hAnsi="Segoe UI"/>
           <w:b/>
           <w:color w:val="222222"/>
-          <w:sz w:val="19"/>
+          <w:sz w:val="18"/>
         </w:rPr>
         <w:t>142 automated JUnit backend tests (100% pass)</w:t>
       </w:r>
@@ -553,7 +583,7 @@
         <w:rPr>
           <w:rFonts w:ascii="Segoe UI" w:hAnsi="Segoe UI"/>
           <w:color w:val="222222"/>
-          <w:sz w:val="19"/>
+          <w:sz w:val="18"/>
         </w:rPr>
         <w:t xml:space="preserve"> + </w:t>
       </w:r>
@@ -562,7 +592,7 @@
           <w:rFonts w:ascii="Segoe UI" w:hAnsi="Segoe UI"/>
           <w:b/>
           <w:color w:val="222222"/>
-          <w:sz w:val="19"/>
+          <w:sz w:val="18"/>
         </w:rPr>
         <w:t>13 automated Vitest frontend tests (100% pass)</w:t>
       </w:r>
@@ -570,7 +600,7 @@
         <w:rPr>
           <w:rFonts w:ascii="Segoe UI" w:hAnsi="Segoe UI"/>
           <w:color w:val="222222"/>
-          <w:sz w:val="19"/>
+          <w:sz w:val="18"/>
         </w:rPr>
         <w:t xml:space="preserve"> + 46 comprehensive system test scenarios across 7 functional modules.</w:t>
       </w:r>
@@ -584,7 +614,7 @@
         <w:rPr>
           <w:rFonts w:ascii="Segoe UI" w:hAnsi="Segoe UI"/>
           <w:color w:val="222222"/>
-          <w:sz w:val="19"/>
+          <w:sz w:val="18"/>
         </w:rPr>
       </w:r>
       <w:r>
@@ -592,7 +622,7 @@
           <w:rFonts w:ascii="Segoe UI" w:hAnsi="Segoe UI"/>
           <w:b/>
           <w:color w:val="222222"/>
-          <w:sz w:val="19"/>
+          <w:sz w:val="18"/>
         </w:rPr>
         <w:t>Online Link:</w:t>
       </w:r>
@@ -600,7 +630,7 @@
         <w:rPr>
           <w:rFonts w:ascii="Segoe UI" w:hAnsi="Segoe UI"/>
           <w:color w:val="222222"/>
-          <w:sz w:val="19"/>
+          <w:sz w:val="18"/>
         </w:rPr>
         <w:t xml:space="preserve"> `[Insert Google Docs / Sheets View Link here]` (Set to *"Anyone with the link can view"*).</w:t>
       </w:r>
@@ -625,7 +655,7 @@
           <w:rFonts w:ascii="Segoe UI" w:hAnsi="Segoe UI"/>
           <w:b/>
           <w:color w:val="222222"/>
-          <w:sz w:val="24"/>
+          <w:sz w:val="22"/>
         </w:rPr>
         <w:t>1.5 Functional &amp; Non-Functional Requirements Document</w:t>
       </w:r>
@@ -639,7 +669,7 @@
         <w:rPr>
           <w:rFonts w:ascii="Segoe UI" w:hAnsi="Segoe UI"/>
           <w:color w:val="222222"/>
-          <w:sz w:val="19"/>
+          <w:sz w:val="18"/>
         </w:rPr>
       </w:r>
       <w:r>
@@ -647,7 +677,7 @@
           <w:rFonts w:ascii="Segoe UI" w:hAnsi="Segoe UI"/>
           <w:b/>
           <w:color w:val="222222"/>
-          <w:sz w:val="19"/>
+          <w:sz w:val="18"/>
         </w:rPr>
         <w:t>Source Artifact:</w:t>
       </w:r>
@@ -655,7 +685,7 @@
         <w:rPr>
           <w:rFonts w:ascii="Segoe UI" w:hAnsi="Segoe UI"/>
           <w:color w:val="222222"/>
-          <w:sz w:val="19"/>
+          <w:sz w:val="18"/>
         </w:rPr>
         <w:t xml:space="preserve"> `MagulaPlan_Complete_Project_Development_Documentation.docx` (Sections 3, 4, 16, 17).</w:t>
       </w:r>
@@ -669,7 +699,7 @@
         <w:rPr>
           <w:rFonts w:ascii="Segoe UI" w:hAnsi="Segoe UI"/>
           <w:color w:val="222222"/>
-          <w:sz w:val="19"/>
+          <w:sz w:val="18"/>
         </w:rPr>
       </w:r>
       <w:r>
@@ -677,7 +707,7 @@
           <w:rFonts w:ascii="Segoe UI" w:hAnsi="Segoe UI"/>
           <w:b/>
           <w:color w:val="222222"/>
-          <w:sz w:val="19"/>
+          <w:sz w:val="18"/>
         </w:rPr>
         <w:t>Online Link:</w:t>
       </w:r>
@@ -685,7 +715,7 @@
         <w:rPr>
           <w:rFonts w:ascii="Segoe UI" w:hAnsi="Segoe UI"/>
           <w:color w:val="222222"/>
-          <w:sz w:val="19"/>
+          <w:sz w:val="18"/>
         </w:rPr>
         <w:t xml:space="preserve"> `[Insert Google Doc View Link here]` (Set to *"Anyone with the link can view"*).</w:t>
       </w:r>
@@ -710,7 +740,7 @@
           <w:rFonts w:ascii="Segoe UI" w:hAnsi="Segoe UI"/>
           <w:b/>
           <w:color w:val="222222"/>
-          <w:sz w:val="24"/>
+          <w:sz w:val="22"/>
         </w:rPr>
         <w:t>1.6 High-Level Architecture Diagram</w:t>
       </w:r>
@@ -724,7 +754,7 @@
         <w:rPr>
           <w:rFonts w:ascii="Segoe UI" w:hAnsi="Segoe UI"/>
           <w:color w:val="222222"/>
-          <w:sz w:val="19"/>
+          <w:sz w:val="18"/>
         </w:rPr>
       </w:r>
       <w:r>
@@ -732,7 +762,7 @@
           <w:rFonts w:ascii="Segoe UI" w:hAnsi="Segoe UI"/>
           <w:b/>
           <w:color w:val="222222"/>
-          <w:sz w:val="19"/>
+          <w:sz w:val="18"/>
         </w:rPr>
         <w:t>Source Artifacts:</w:t>
       </w:r>
@@ -740,7 +770,7 @@
         <w:rPr>
           <w:rFonts w:ascii="Segoe UI" w:hAnsi="Segoe UI"/>
           <w:color w:val="222222"/>
-          <w:sz w:val="19"/>
+          <w:sz w:val="18"/>
         </w:rPr>
         <w:t xml:space="preserve"> `Magula.lk/docs/High_Level_Architecture_Diagram.png` (High-Res 300 DPI Rendering), `Magula.lk/docs/High_Level_Architecture_Diagram.md`, and `MagulaPlan_Presentation.pptx` (Slide 5 &amp; Slide 9).</w:t>
       </w:r>
@@ -754,7 +784,7 @@
         <w:rPr>
           <w:rFonts w:ascii="Segoe UI" w:hAnsi="Segoe UI"/>
           <w:color w:val="222222"/>
-          <w:sz w:val="19"/>
+          <w:sz w:val="18"/>
         </w:rPr>
       </w:r>
       <w:r>
@@ -762,7 +792,7 @@
           <w:rFonts w:ascii="Segoe UI" w:hAnsi="Segoe UI"/>
           <w:b/>
           <w:color w:val="222222"/>
-          <w:sz w:val="19"/>
+          <w:sz w:val="18"/>
         </w:rPr>
         <w:t>Online Link:</w:t>
       </w:r>
@@ -770,7 +800,7 @@
         <w:rPr>
           <w:rFonts w:ascii="Segoe UI" w:hAnsi="Segoe UI"/>
           <w:color w:val="222222"/>
-          <w:sz w:val="19"/>
+          <w:sz w:val="18"/>
         </w:rPr>
         <w:t xml:space="preserve"> `[Insert Google Drive / Figma / Miro Architecture View Link here]` (Set to *"Anyone with the link can view"*).</w:t>
       </w:r>
@@ -795,7 +825,7 @@
           <w:rFonts w:ascii="Playfair Display" w:hAnsi="Playfair Display"/>
           <w:b/>
           <w:color w:val="721F3A"/>
-          <w:sz w:val="30"/>
+          <w:sz w:val="28"/>
         </w:rPr>
         <w:t>2. Live Deployment Endpoints &amp; Demo Credentials</w:t>
       </w:r>
@@ -807,19 +837,19 @@
         <w:tblLook w:firstColumn="1" w:firstRow="1" w:lastColumn="0" w:lastRow="0" w:noHBand="0" w:noVBand="1" w:val="04A0"/>
       </w:tblPr>
       <w:tblGrid>
-        <w:gridCol w:w="3216"/>
-        <w:gridCol w:w="3216"/>
-        <w:gridCol w:w="3216"/>
+        <w:gridCol w:w="3264"/>
+        <w:gridCol w:w="3264"/>
+        <w:gridCol w:w="3264"/>
       </w:tblGrid>
       <w:tr>
         <w:tc>
           <w:tcPr>
-            <w:tcW w:type="dxa" w:w="3216"/>
+            <w:tcW w:type="dxa" w:w="3264"/>
             <w:tcMar>
-              <w:top w:w="100" w:type="dxa"/>
-              <w:bottom w:w="100" w:type="dxa"/>
-              <w:left w:w="120" w:type="dxa"/>
-              <w:right w:w="120" w:type="dxa"/>
+              <w:top w:w="70" w:type="dxa"/>
+              <w:bottom w:w="70" w:type="dxa"/>
+              <w:left w:w="90" w:type="dxa"/>
+              <w:right w:w="90" w:type="dxa"/>
             </w:tcMar>
             <w:shd w:fill="721F3A"/>
           </w:tcPr>
@@ -829,7 +859,7 @@
                 <w:rFonts w:ascii="Segoe UI" w:hAnsi="Segoe UI"/>
                 <w:b/>
                 <w:color w:val="FFFFFF"/>
-                <w:sz w:val="18"/>
+                <w:sz w:val="17"/>
               </w:rPr>
               <w:t>Endpoint / Resource</w:t>
             </w:r>
@@ -837,12 +867,12 @@
         </w:tc>
         <w:tc>
           <w:tcPr>
-            <w:tcW w:type="dxa" w:w="3216"/>
+            <w:tcW w:type="dxa" w:w="3264"/>
             <w:tcMar>
-              <w:top w:w="100" w:type="dxa"/>
-              <w:bottom w:w="100" w:type="dxa"/>
-              <w:left w:w="120" w:type="dxa"/>
-              <w:right w:w="120" w:type="dxa"/>
+              <w:top w:w="70" w:type="dxa"/>
+              <w:bottom w:w="70" w:type="dxa"/>
+              <w:left w:w="90" w:type="dxa"/>
+              <w:right w:w="90" w:type="dxa"/>
             </w:tcMar>
             <w:shd w:fill="721F3A"/>
           </w:tcPr>
@@ -852,7 +882,7 @@
                 <w:rFonts w:ascii="Segoe UI" w:hAnsi="Segoe UI"/>
                 <w:b/>
                 <w:color w:val="FFFFFF"/>
-                <w:sz w:val="18"/>
+                <w:sz w:val="17"/>
               </w:rPr>
               <w:t>Live URL</w:t>
             </w:r>
@@ -860,12 +890,12 @@
         </w:tc>
         <w:tc>
           <w:tcPr>
-            <w:tcW w:type="dxa" w:w="3216"/>
+            <w:tcW w:type="dxa" w:w="3264"/>
             <w:tcMar>
-              <w:top w:w="100" w:type="dxa"/>
-              <w:bottom w:w="100" w:type="dxa"/>
-              <w:left w:w="120" w:type="dxa"/>
-              <w:right w:w="120" w:type="dxa"/>
+              <w:top w:w="70" w:type="dxa"/>
+              <w:bottom w:w="70" w:type="dxa"/>
+              <w:left w:w="90" w:type="dxa"/>
+              <w:right w:w="90" w:type="dxa"/>
             </w:tcMar>
             <w:shd w:fill="721F3A"/>
           </w:tcPr>
@@ -875,7 +905,7 @@
                 <w:rFonts w:ascii="Segoe UI" w:hAnsi="Segoe UI"/>
                 <w:b/>
                 <w:color w:val="FFFFFF"/>
-                <w:sz w:val="18"/>
+                <w:sz w:val="17"/>
               </w:rPr>
               <w:t>Notes / Configuration</w:t>
             </w:r>
@@ -885,12 +915,12 @@
       <w:tr>
         <w:tc>
           <w:tcPr>
-            <w:tcW w:type="dxa" w:w="3216"/>
+            <w:tcW w:type="dxa" w:w="3264"/>
             <w:tcMar>
-              <w:top w:w="100" w:type="dxa"/>
-              <w:bottom w:w="100" w:type="dxa"/>
-              <w:left w:w="120" w:type="dxa"/>
-              <w:right w:w="120" w:type="dxa"/>
+              <w:top w:w="70" w:type="dxa"/>
+              <w:bottom w:w="70" w:type="dxa"/>
+              <w:left w:w="90" w:type="dxa"/>
+              <w:right w:w="90" w:type="dxa"/>
             </w:tcMar>
             <w:shd w:fill="FAF7F2"/>
           </w:tcPr>
@@ -899,7 +929,7 @@
               <w:rPr>
                 <w:rFonts w:ascii="Segoe UI" w:hAnsi="Segoe UI"/>
                 <w:color w:val="222222"/>
-                <w:sz w:val="17"/>
+                <w:sz w:val="16"/>
               </w:rPr>
               <w:t>**Live Frontend (Primary Mirror)**</w:t>
             </w:r>
@@ -907,12 +937,12 @@
         </w:tc>
         <w:tc>
           <w:tcPr>
-            <w:tcW w:type="dxa" w:w="3216"/>
+            <w:tcW w:type="dxa" w:w="3264"/>
             <w:tcMar>
-              <w:top w:w="100" w:type="dxa"/>
-              <w:bottom w:w="100" w:type="dxa"/>
-              <w:left w:w="120" w:type="dxa"/>
-              <w:right w:w="120" w:type="dxa"/>
+              <w:top w:w="70" w:type="dxa"/>
+              <w:bottom w:w="70" w:type="dxa"/>
+              <w:left w:w="90" w:type="dxa"/>
+              <w:right w:w="90" w:type="dxa"/>
             </w:tcMar>
             <w:shd w:fill="FAF7F2"/>
           </w:tcPr>
@@ -921,7 +951,7 @@
               <w:rPr>
                 <w:rFonts w:ascii="Segoe UI" w:hAnsi="Segoe UI"/>
                 <w:color w:val="222222"/>
-                <w:sz w:val="17"/>
+                <w:sz w:val="16"/>
               </w:rPr>
               <w:t>`https://magulaplan.infinityfreeapp.com/?i=1`</w:t>
             </w:r>
@@ -929,12 +959,12 @@
         </w:tc>
         <w:tc>
           <w:tcPr>
-            <w:tcW w:type="dxa" w:w="3216"/>
+            <w:tcW w:type="dxa" w:w="3264"/>
             <w:tcMar>
-              <w:top w:w="100" w:type="dxa"/>
-              <w:bottom w:w="100" w:type="dxa"/>
-              <w:left w:w="120" w:type="dxa"/>
-              <w:right w:w="120" w:type="dxa"/>
+              <w:top w:w="70" w:type="dxa"/>
+              <w:bottom w:w="70" w:type="dxa"/>
+              <w:left w:w="90" w:type="dxa"/>
+              <w:right w:w="90" w:type="dxa"/>
             </w:tcMar>
             <w:shd w:fill="FAF7F2"/>
           </w:tcPr>
@@ -943,7 +973,7 @@
               <w:rPr>
                 <w:rFonts w:ascii="Segoe UI" w:hAnsi="Segoe UI"/>
                 <w:color w:val="222222"/>
-                <w:sz w:val="17"/>
+                <w:sz w:val="16"/>
               </w:rPr>
               <w:t>Deployed on Apache storage with SPA `.htaccess` routing and dynamic API host fallback.</w:t>
             </w:r>
@@ -953,12 +983,12 @@
       <w:tr>
         <w:tc>
           <w:tcPr>
-            <w:tcW w:type="dxa" w:w="3216"/>
+            <w:tcW w:type="dxa" w:w="3264"/>
             <w:tcMar>
-              <w:top w:w="100" w:type="dxa"/>
-              <w:bottom w:w="100" w:type="dxa"/>
-              <w:left w:w="120" w:type="dxa"/>
-              <w:right w:w="120" w:type="dxa"/>
+              <w:top w:w="70" w:type="dxa"/>
+              <w:bottom w:w="70" w:type="dxa"/>
+              <w:left w:w="90" w:type="dxa"/>
+              <w:right w:w="90" w:type="dxa"/>
             </w:tcMar>
           </w:tcPr>
           <w:p>
@@ -966,7 +996,7 @@
               <w:rPr>
                 <w:rFonts w:ascii="Segoe UI" w:hAnsi="Segoe UI"/>
                 <w:color w:val="222222"/>
-                <w:sz w:val="17"/>
+                <w:sz w:val="16"/>
               </w:rPr>
               <w:t>**Live Frontend (Edge CDN)**</w:t>
             </w:r>
@@ -974,12 +1004,12 @@
         </w:tc>
         <w:tc>
           <w:tcPr>
-            <w:tcW w:type="dxa" w:w="3216"/>
+            <w:tcW w:type="dxa" w:w="3264"/>
             <w:tcMar>
-              <w:top w:w="100" w:type="dxa"/>
-              <w:bottom w:w="100" w:type="dxa"/>
-              <w:left w:w="120" w:type="dxa"/>
-              <w:right w:w="120" w:type="dxa"/>
+              <w:top w:w="70" w:type="dxa"/>
+              <w:bottom w:w="70" w:type="dxa"/>
+              <w:left w:w="90" w:type="dxa"/>
+              <w:right w:w="90" w:type="dxa"/>
             </w:tcMar>
           </w:tcPr>
           <w:p>
@@ -987,7 +1017,7 @@
               <w:rPr>
                 <w:rFonts w:ascii="Segoe UI" w:hAnsi="Segoe UI"/>
                 <w:color w:val="222222"/>
-                <w:sz w:val="17"/>
+                <w:sz w:val="16"/>
               </w:rPr>
               <w:t>`https://magulaplan.netlify.app`</w:t>
             </w:r>
@@ -995,12 +1025,12 @@
         </w:tc>
         <w:tc>
           <w:tcPr>
-            <w:tcW w:type="dxa" w:w="3216"/>
+            <w:tcW w:type="dxa" w:w="3264"/>
             <w:tcMar>
-              <w:top w:w="100" w:type="dxa"/>
-              <w:bottom w:w="100" w:type="dxa"/>
-              <w:left w:w="120" w:type="dxa"/>
-              <w:right w:w="120" w:type="dxa"/>
+              <w:top w:w="70" w:type="dxa"/>
+              <w:bottom w:w="70" w:type="dxa"/>
+              <w:left w:w="90" w:type="dxa"/>
+              <w:right w:w="90" w:type="dxa"/>
             </w:tcMar>
           </w:tcPr>
           <w:p>
@@ -1008,7 +1038,7 @@
               <w:rPr>
                 <w:rFonts w:ascii="Segoe UI" w:hAnsi="Segoe UI"/>
                 <w:color w:val="222222"/>
-                <w:sz w:val="17"/>
+                <w:sz w:val="16"/>
               </w:rPr>
               <w:t>Hosted on global edge CDN with automated CI/CD from `main`.</w:t>
             </w:r>
@@ -1018,12 +1048,12 @@
       <w:tr>
         <w:tc>
           <w:tcPr>
-            <w:tcW w:type="dxa" w:w="3216"/>
+            <w:tcW w:type="dxa" w:w="3264"/>
             <w:tcMar>
-              <w:top w:w="100" w:type="dxa"/>
-              <w:bottom w:w="100" w:type="dxa"/>
-              <w:left w:w="120" w:type="dxa"/>
-              <w:right w:w="120" w:type="dxa"/>
+              <w:top w:w="70" w:type="dxa"/>
+              <w:bottom w:w="70" w:type="dxa"/>
+              <w:left w:w="90" w:type="dxa"/>
+              <w:right w:w="90" w:type="dxa"/>
             </w:tcMar>
             <w:shd w:fill="FAF7F2"/>
           </w:tcPr>
@@ -1032,7 +1062,7 @@
               <w:rPr>
                 <w:rFonts w:ascii="Segoe UI" w:hAnsi="Segoe UI"/>
                 <w:color w:val="222222"/>
-                <w:sz w:val="17"/>
+                <w:sz w:val="16"/>
               </w:rPr>
               <w:t>**Live Backend API (Production)**</w:t>
             </w:r>
@@ -1040,12 +1070,12 @@
         </w:tc>
         <w:tc>
           <w:tcPr>
-            <w:tcW w:type="dxa" w:w="3216"/>
+            <w:tcW w:type="dxa" w:w="3264"/>
             <w:tcMar>
-              <w:top w:w="100" w:type="dxa"/>
-              <w:bottom w:w="100" w:type="dxa"/>
-              <w:left w:w="120" w:type="dxa"/>
-              <w:right w:w="120" w:type="dxa"/>
+              <w:top w:w="70" w:type="dxa"/>
+              <w:bottom w:w="70" w:type="dxa"/>
+              <w:left w:w="90" w:type="dxa"/>
+              <w:right w:w="90" w:type="dxa"/>
             </w:tcMar>
             <w:shd w:fill="FAF7F2"/>
           </w:tcPr>
@@ -1054,7 +1084,7 @@
               <w:rPr>
                 <w:rFonts w:ascii="Segoe UI" w:hAnsi="Segoe UI"/>
                 <w:color w:val="222222"/>
-                <w:sz w:val="17"/>
+                <w:sz w:val="16"/>
               </w:rPr>
               <w:t>`https://magulaplan-api.onrender.com`</w:t>
             </w:r>
@@ -1062,12 +1092,12 @@
         </w:tc>
         <w:tc>
           <w:tcPr>
-            <w:tcW w:type="dxa" w:w="3216"/>
+            <w:tcW w:type="dxa" w:w="3264"/>
             <w:tcMar>
-              <w:top w:w="100" w:type="dxa"/>
-              <w:bottom w:w="100" w:type="dxa"/>
-              <w:left w:w="120" w:type="dxa"/>
-              <w:right w:w="120" w:type="dxa"/>
+              <w:top w:w="70" w:type="dxa"/>
+              <w:bottom w:w="70" w:type="dxa"/>
+              <w:left w:w="90" w:type="dxa"/>
+              <w:right w:w="90" w:type="dxa"/>
             </w:tcMar>
             <w:shd w:fill="FAF7F2"/>
           </w:tcPr>
@@ -1076,7 +1106,7 @@
               <w:rPr>
                 <w:rFonts w:ascii="Segoe UI" w:hAnsi="Segoe UI"/>
                 <w:color w:val="222222"/>
-                <w:sz w:val="17"/>
+                <w:sz w:val="16"/>
               </w:rPr>
               <w:t>Spring Boot 4.1 containerized runtime on Java 17 with MySQL 8.4 persistence.</w:t>
             </w:r>
@@ -1086,12 +1116,12 @@
       <w:tr>
         <w:tc>
           <w:tcPr>
-            <w:tcW w:type="dxa" w:w="3216"/>
+            <w:tcW w:type="dxa" w:w="3264"/>
             <w:tcMar>
-              <w:top w:w="100" w:type="dxa"/>
-              <w:bottom w:w="100" w:type="dxa"/>
-              <w:left w:w="120" w:type="dxa"/>
-              <w:right w:w="120" w:type="dxa"/>
+              <w:top w:w="70" w:type="dxa"/>
+              <w:bottom w:w="70" w:type="dxa"/>
+              <w:left w:w="90" w:type="dxa"/>
+              <w:right w:w="90" w:type="dxa"/>
             </w:tcMar>
           </w:tcPr>
           <w:p>
@@ -1099,7 +1129,7 @@
               <w:rPr>
                 <w:rFonts w:ascii="Segoe UI" w:hAnsi="Segoe UI"/>
                 <w:color w:val="222222"/>
-                <w:sz w:val="17"/>
+                <w:sz w:val="16"/>
               </w:rPr>
               <w:t>**API Health Check**</w:t>
             </w:r>
@@ -1107,12 +1137,12 @@
         </w:tc>
         <w:tc>
           <w:tcPr>
-            <w:tcW w:type="dxa" w:w="3216"/>
+            <w:tcW w:type="dxa" w:w="3264"/>
             <w:tcMar>
-              <w:top w:w="100" w:type="dxa"/>
-              <w:bottom w:w="100" w:type="dxa"/>
-              <w:left w:w="120" w:type="dxa"/>
-              <w:right w:w="120" w:type="dxa"/>
+              <w:top w:w="70" w:type="dxa"/>
+              <w:bottom w:w="70" w:type="dxa"/>
+              <w:left w:w="90" w:type="dxa"/>
+              <w:right w:w="90" w:type="dxa"/>
             </w:tcMar>
           </w:tcPr>
           <w:p>
@@ -1120,7 +1150,7 @@
               <w:rPr>
                 <w:rFonts w:ascii="Segoe UI" w:hAnsi="Segoe UI"/>
                 <w:color w:val="222222"/>
-                <w:sz w:val="17"/>
+                <w:sz w:val="16"/>
               </w:rPr>
               <w:t>`https://magulaplan-api.onrender.com/api/v1/vendor-categories`</w:t>
             </w:r>
@@ -1128,12 +1158,12 @@
         </w:tc>
         <w:tc>
           <w:tcPr>
-            <w:tcW w:type="dxa" w:w="3216"/>
+            <w:tcW w:type="dxa" w:w="3264"/>
             <w:tcMar>
-              <w:top w:w="100" w:type="dxa"/>
-              <w:bottom w:w="100" w:type="dxa"/>
-              <w:left w:w="120" w:type="dxa"/>
-              <w:right w:w="120" w:type="dxa"/>
+              <w:top w:w="70" w:type="dxa"/>
+              <w:bottom w:w="70" w:type="dxa"/>
+              <w:left w:w="90" w:type="dxa"/>
+              <w:right w:w="90" w:type="dxa"/>
             </w:tcMar>
           </w:tcPr>
           <w:p>
@@ -1141,7 +1171,7 @@
               <w:rPr>
                 <w:rFonts w:ascii="Segoe UI" w:hAnsi="Segoe UI"/>
                 <w:color w:val="222222"/>
-                <w:sz w:val="17"/>
+                <w:sz w:val="16"/>
               </w:rPr>
               <w:t>Public endpoint for testing server readiness.</w:t>
             </w:r>
@@ -1151,12 +1181,12 @@
       <w:tr>
         <w:tc>
           <w:tcPr>
-            <w:tcW w:type="dxa" w:w="3216"/>
+            <w:tcW w:type="dxa" w:w="3264"/>
             <w:tcMar>
-              <w:top w:w="100" w:type="dxa"/>
-              <w:bottom w:w="100" w:type="dxa"/>
-              <w:left w:w="120" w:type="dxa"/>
-              <w:right w:w="120" w:type="dxa"/>
+              <w:top w:w="70" w:type="dxa"/>
+              <w:bottom w:w="70" w:type="dxa"/>
+              <w:left w:w="90" w:type="dxa"/>
+              <w:right w:w="90" w:type="dxa"/>
             </w:tcMar>
             <w:shd w:fill="FAF7F2"/>
           </w:tcPr>
@@ -1165,7 +1195,7 @@
               <w:rPr>
                 <w:rFonts w:ascii="Segoe UI" w:hAnsi="Segoe UI"/>
                 <w:color w:val="222222"/>
-                <w:sz w:val="17"/>
+                <w:sz w:val="16"/>
               </w:rPr>
               <w:t>**Admin Demo Login**</w:t>
             </w:r>
@@ -1173,12 +1203,12 @@
         </w:tc>
         <w:tc>
           <w:tcPr>
-            <w:tcW w:type="dxa" w:w="3216"/>
+            <w:tcW w:type="dxa" w:w="3264"/>
             <w:tcMar>
-              <w:top w:w="100" w:type="dxa"/>
-              <w:bottom w:w="100" w:type="dxa"/>
-              <w:left w:w="120" w:type="dxa"/>
-              <w:right w:w="120" w:type="dxa"/>
+              <w:top w:w="70" w:type="dxa"/>
+              <w:bottom w:w="70" w:type="dxa"/>
+              <w:left w:w="90" w:type="dxa"/>
+              <w:right w:w="90" w:type="dxa"/>
             </w:tcMar>
             <w:shd w:fill="FAF7F2"/>
           </w:tcPr>
@@ -1187,7 +1217,7 @@
               <w:rPr>
                 <w:rFonts w:ascii="Segoe UI" w:hAnsi="Segoe UI"/>
                 <w:color w:val="222222"/>
-                <w:sz w:val="17"/>
+                <w:sz w:val="16"/>
               </w:rPr>
               <w:t>Email: `admin@magulaplan.lk`</w:t>
               <w:br/>
@@ -1197,12 +1227,12 @@
         </w:tc>
         <w:tc>
           <w:tcPr>
-            <w:tcW w:type="dxa" w:w="3216"/>
+            <w:tcW w:type="dxa" w:w="3264"/>
             <w:tcMar>
-              <w:top w:w="100" w:type="dxa"/>
-              <w:bottom w:w="100" w:type="dxa"/>
-              <w:left w:w="120" w:type="dxa"/>
-              <w:right w:w="120" w:type="dxa"/>
+              <w:top w:w="70" w:type="dxa"/>
+              <w:bottom w:w="70" w:type="dxa"/>
+              <w:left w:w="90" w:type="dxa"/>
+              <w:right w:w="90" w:type="dxa"/>
             </w:tcMar>
             <w:shd w:fill="FAF7F2"/>
           </w:tcPr>
@@ -1211,7 +1241,7 @@
               <w:rPr>
                 <w:rFonts w:ascii="Segoe UI" w:hAnsi="Segoe UI"/>
                 <w:color w:val="222222"/>
-                <w:sz w:val="17"/>
+                <w:sz w:val="16"/>
               </w:rPr>
               <w:t>Role: `ADMIN` (Access to `/admin` vendor moderation queue, metrics, and user safety).</w:t>
             </w:r>
@@ -1221,12 +1251,12 @@
       <w:tr>
         <w:tc>
           <w:tcPr>
-            <w:tcW w:type="dxa" w:w="3216"/>
+            <w:tcW w:type="dxa" w:w="3264"/>
             <w:tcMar>
-              <w:top w:w="100" w:type="dxa"/>
-              <w:bottom w:w="100" w:type="dxa"/>
-              <w:left w:w="120" w:type="dxa"/>
-              <w:right w:w="120" w:type="dxa"/>
+              <w:top w:w="70" w:type="dxa"/>
+              <w:bottom w:w="70" w:type="dxa"/>
+              <w:left w:w="90" w:type="dxa"/>
+              <w:right w:w="90" w:type="dxa"/>
             </w:tcMar>
           </w:tcPr>
           <w:p>
@@ -1234,7 +1264,7 @@
               <w:rPr>
                 <w:rFonts w:ascii="Segoe UI" w:hAnsi="Segoe UI"/>
                 <w:color w:val="222222"/>
-                <w:sz w:val="17"/>
+                <w:sz w:val="16"/>
               </w:rPr>
               <w:t>**Couple Demo Login**</w:t>
             </w:r>
@@ -1242,12 +1272,12 @@
         </w:tc>
         <w:tc>
           <w:tcPr>
-            <w:tcW w:type="dxa" w:w="3216"/>
+            <w:tcW w:type="dxa" w:w="3264"/>
             <w:tcMar>
-              <w:top w:w="100" w:type="dxa"/>
-              <w:bottom w:w="100" w:type="dxa"/>
-              <w:left w:w="120" w:type="dxa"/>
-              <w:right w:w="120" w:type="dxa"/>
+              <w:top w:w="70" w:type="dxa"/>
+              <w:bottom w:w="70" w:type="dxa"/>
+              <w:left w:w="90" w:type="dxa"/>
+              <w:right w:w="90" w:type="dxa"/>
             </w:tcMar>
           </w:tcPr>
           <w:p>
@@ -1255,7 +1285,7 @@
               <w:rPr>
                 <w:rFonts w:ascii="Segoe UI" w:hAnsi="Segoe UI"/>
                 <w:color w:val="222222"/>
-                <w:sz w:val="17"/>
+                <w:sz w:val="16"/>
               </w:rPr>
               <w:t>Email: `test@magulaplan.lk`</w:t>
               <w:br/>
@@ -1265,12 +1295,12 @@
         </w:tc>
         <w:tc>
           <w:tcPr>
-            <w:tcW w:type="dxa" w:w="3216"/>
+            <w:tcW w:type="dxa" w:w="3264"/>
             <w:tcMar>
-              <w:top w:w="100" w:type="dxa"/>
-              <w:bottom w:w="100" w:type="dxa"/>
-              <w:left w:w="120" w:type="dxa"/>
-              <w:right w:w="120" w:type="dxa"/>
+              <w:top w:w="70" w:type="dxa"/>
+              <w:bottom w:w="70" w:type="dxa"/>
+              <w:left w:w="90" w:type="dxa"/>
+              <w:right w:w="90" w:type="dxa"/>
             </w:tcMar>
           </w:tcPr>
           <w:p>
@@ -1278,7 +1308,7 @@
               <w:rPr>
                 <w:rFonts w:ascii="Segoe UI" w:hAnsi="Segoe UI"/>
                 <w:color w:val="222222"/>
-                <w:sz w:val="17"/>
+                <w:sz w:val="16"/>
               </w:rPr>
               <w:t>Role: `USER` (Access to `/dashboard`, budget tracker, guest list, and WhatsApp invitations).</w:t>
             </w:r>
@@ -1288,12 +1318,12 @@
       <w:tr>
         <w:tc>
           <w:tcPr>
-            <w:tcW w:type="dxa" w:w="3216"/>
+            <w:tcW w:type="dxa" w:w="3264"/>
             <w:tcMar>
-              <w:top w:w="100" w:type="dxa"/>
-              <w:bottom w:w="100" w:type="dxa"/>
-              <w:left w:w="120" w:type="dxa"/>
-              <w:right w:w="120" w:type="dxa"/>
+              <w:top w:w="70" w:type="dxa"/>
+              <w:bottom w:w="70" w:type="dxa"/>
+              <w:left w:w="90" w:type="dxa"/>
+              <w:right w:w="90" w:type="dxa"/>
             </w:tcMar>
             <w:shd w:fill="FAF7F2"/>
           </w:tcPr>
@@ -1302,7 +1332,7 @@
               <w:rPr>
                 <w:rFonts w:ascii="Segoe UI" w:hAnsi="Segoe UI"/>
                 <w:color w:val="222222"/>
-                <w:sz w:val="17"/>
+                <w:sz w:val="16"/>
               </w:rPr>
               <w:t>**Vendor Demo Login**</w:t>
             </w:r>
@@ -1310,12 +1340,12 @@
         </w:tc>
         <w:tc>
           <w:tcPr>
-            <w:tcW w:type="dxa" w:w="3216"/>
+            <w:tcW w:type="dxa" w:w="3264"/>
             <w:tcMar>
-              <w:top w:w="100" w:type="dxa"/>
-              <w:bottom w:w="100" w:type="dxa"/>
-              <w:left w:w="120" w:type="dxa"/>
-              <w:right w:w="120" w:type="dxa"/>
+              <w:top w:w="70" w:type="dxa"/>
+              <w:bottom w:w="70" w:type="dxa"/>
+              <w:left w:w="90" w:type="dxa"/>
+              <w:right w:w="90" w:type="dxa"/>
             </w:tcMar>
             <w:shd w:fill="FAF7F2"/>
           </w:tcPr>
@@ -1324,7 +1354,7 @@
               <w:rPr>
                 <w:rFonts w:ascii="Segoe UI" w:hAnsi="Segoe UI"/>
                 <w:color w:val="222222"/>
-                <w:sz w:val="17"/>
+                <w:sz w:val="16"/>
               </w:rPr>
               <w:t>Email: `vendor@magulaplan.lk`</w:t>
               <w:br/>
@@ -1334,12 +1364,12 @@
         </w:tc>
         <w:tc>
           <w:tcPr>
-            <w:tcW w:type="dxa" w:w="3216"/>
+            <w:tcW w:type="dxa" w:w="3264"/>
             <w:tcMar>
-              <w:top w:w="100" w:type="dxa"/>
-              <w:bottom w:w="100" w:type="dxa"/>
-              <w:left w:w="120" w:type="dxa"/>
-              <w:right w:w="120" w:type="dxa"/>
+              <w:top w:w="70" w:type="dxa"/>
+              <w:bottom w:w="70" w:type="dxa"/>
+              <w:left w:w="90" w:type="dxa"/>
+              <w:right w:w="90" w:type="dxa"/>
             </w:tcMar>
             <w:shd w:fill="FAF7F2"/>
           </w:tcPr>
@@ -1348,7 +1378,7 @@
               <w:rPr>
                 <w:rFonts w:ascii="Segoe UI" w:hAnsi="Segoe UI"/>
                 <w:color w:val="222222"/>
-                <w:sz w:val="17"/>
+                <w:sz w:val="16"/>
               </w:rPr>
               <w:t>Role: `VENDOR` (Access to `/vendor/dashboard` incoming customer leads, listing editor, and plan tiers).</w:t>
             </w:r>
@@ -1358,7 +1388,7 @@
     </w:tbl>
     <w:p>
       <w:pPr>
-        <w:spacing w:after="120"/>
+        <w:spacing w:after="80"/>
       </w:pPr>
     </w:p>
     <w:p>
@@ -1381,7 +1411,7 @@
           <w:rFonts w:ascii="Playfair Display" w:hAnsi="Playfair Display"/>
           <w:b/>
           <w:color w:val="721F3A"/>
-          <w:sz w:val="30"/>
+          <w:sz w:val="28"/>
         </w:rPr>
         <w:t>3. Submission Verification Checklist</w:t>
       </w:r>
@@ -1395,7 +1425,7 @@
         <w:rPr>
           <w:rFonts w:ascii="Segoe UI" w:hAnsi="Segoe UI"/>
           <w:color w:val="222222"/>
-          <w:sz w:val="19"/>
+          <w:sz w:val="18"/>
         </w:rPr>
         <w:t xml:space="preserve">[x] </w:t>
       </w:r>
@@ -1404,7 +1434,7 @@
           <w:rFonts w:ascii="Segoe UI" w:hAnsi="Segoe UI"/>
           <w:b/>
           <w:color w:val="222222"/>
-          <w:sz w:val="19"/>
+          <w:sz w:val="18"/>
         </w:rPr>
         <w:t>Figma file link:</w:t>
       </w:r>
@@ -1412,7 +1442,7 @@
         <w:rPr>
           <w:rFonts w:ascii="Segoe UI" w:hAnsi="Segoe UI"/>
           <w:color w:val="222222"/>
-          <w:sz w:val="19"/>
+          <w:sz w:val="18"/>
         </w:rPr>
         <w:t xml:space="preserve"> Generated with "Anyone with the link can view".</w:t>
       </w:r>
@@ -1426,7 +1456,7 @@
         <w:rPr>
           <w:rFonts w:ascii="Segoe UI" w:hAnsi="Segoe UI"/>
           <w:color w:val="222222"/>
-          <w:sz w:val="19"/>
+          <w:sz w:val="18"/>
         </w:rPr>
         <w:t xml:space="preserve">[x] </w:t>
       </w:r>
@@ -1435,7 +1465,7 @@
           <w:rFonts w:ascii="Segoe UI" w:hAnsi="Segoe UI"/>
           <w:b/>
           <w:color w:val="222222"/>
-          <w:sz w:val="19"/>
+          <w:sz w:val="18"/>
         </w:rPr>
         <w:t>GitHub repository:</w:t>
       </w:r>
@@ -1443,7 +1473,7 @@
         <w:rPr>
           <w:rFonts w:ascii="Segoe UI" w:hAnsi="Segoe UI"/>
           <w:color w:val="222222"/>
-          <w:sz w:val="19"/>
+          <w:sz w:val="18"/>
         </w:rPr>
         <w:t xml:space="preserve"> Made public, synchronized across `main` and feature branches.</w:t>
       </w:r>
@@ -1457,7 +1487,7 @@
         <w:rPr>
           <w:rFonts w:ascii="Segoe UI" w:hAnsi="Segoe UI"/>
           <w:color w:val="222222"/>
-          <w:sz w:val="19"/>
+          <w:sz w:val="18"/>
         </w:rPr>
         <w:t xml:space="preserve">[x] </w:t>
       </w:r>
@@ -1466,7 +1496,7 @@
           <w:rFonts w:ascii="Segoe UI" w:hAnsi="Segoe UI"/>
           <w:b/>
           <w:color w:val="222222"/>
-          <w:sz w:val="19"/>
+          <w:sz w:val="18"/>
         </w:rPr>
         <w:t>Jira project access:</w:t>
       </w:r>
@@ -1474,7 +1504,7 @@
         <w:rPr>
           <w:rFonts w:ascii="Segoe UI" w:hAnsi="Segoe UI"/>
           <w:color w:val="222222"/>
-          <w:sz w:val="19"/>
+          <w:sz w:val="18"/>
         </w:rPr>
         <w:t xml:space="preserve"> `chamathkara.k@sltc.ac.lk` invited as Viewer.</w:t>
       </w:r>
@@ -1488,7 +1518,7 @@
         <w:rPr>
           <w:rFonts w:ascii="Segoe UI" w:hAnsi="Segoe UI"/>
           <w:color w:val="222222"/>
-          <w:sz w:val="19"/>
+          <w:sz w:val="18"/>
         </w:rPr>
         <w:t xml:space="preserve">[x] </w:t>
       </w:r>
@@ -1497,7 +1527,7 @@
           <w:rFonts w:ascii="Segoe UI" w:hAnsi="Segoe UI"/>
           <w:b/>
           <w:color w:val="222222"/>
-          <w:sz w:val="19"/>
+          <w:sz w:val="18"/>
         </w:rPr>
         <w:t>Test Cases document:</w:t>
       </w:r>
@@ -1505,7 +1535,7 @@
         <w:rPr>
           <w:rFonts w:ascii="Segoe UI" w:hAnsi="Segoe UI"/>
           <w:color w:val="222222"/>
-          <w:sz w:val="19"/>
+          <w:sz w:val="18"/>
         </w:rPr>
         <w:t xml:space="preserve"> Documented and verified (142 JUnit + 13 Vitest + 46 system test cases).</w:t>
       </w:r>
@@ -1519,7 +1549,7 @@
         <w:rPr>
           <w:rFonts w:ascii="Segoe UI" w:hAnsi="Segoe UI"/>
           <w:color w:val="222222"/>
-          <w:sz w:val="19"/>
+          <w:sz w:val="18"/>
         </w:rPr>
         <w:t xml:space="preserve">[x] </w:t>
       </w:r>
@@ -1528,7 +1558,7 @@
           <w:rFonts w:ascii="Segoe UI" w:hAnsi="Segoe UI"/>
           <w:b/>
           <w:color w:val="222222"/>
-          <w:sz w:val="19"/>
+          <w:sz w:val="18"/>
         </w:rPr>
         <w:t>SRS &amp; Architecture diagram:</w:t>
       </w:r>
@@ -1536,7 +1566,7 @@
         <w:rPr>
           <w:rFonts w:ascii="Segoe UI" w:hAnsi="Segoe UI"/>
           <w:color w:val="222222"/>
-          <w:sz w:val="19"/>
+          <w:sz w:val="18"/>
         </w:rPr>
         <w:t xml:space="preserve"> Multi-role 3-tier diagram compiled in high-res PNG, Mermaid, ASCII, PowerPoint, and Word report.</w:t>
       </w:r>
@@ -1550,7 +1580,7 @@
         <w:rPr>
           <w:rFonts w:ascii="Segoe UI" w:hAnsi="Segoe UI"/>
           <w:color w:val="222222"/>
-          <w:sz w:val="19"/>
+          <w:sz w:val="18"/>
         </w:rPr>
         <w:t xml:space="preserve">[x] </w:t>
       </w:r>
@@ -1559,7 +1589,7 @@
           <w:rFonts w:ascii="Segoe UI" w:hAnsi="Segoe UI"/>
           <w:b/>
           <w:color w:val="222222"/>
-          <w:sz w:val="19"/>
+          <w:sz w:val="18"/>
         </w:rPr>
         <w:t>Commercial Monetization Flow:</w:t>
       </w:r>
@@ -1567,7 +1597,7 @@
         <w:rPr>
           <w:rFonts w:ascii="Segoe UI" w:hAnsi="Segoe UI"/>
           <w:color w:val="222222"/>
-          <w:sz w:val="19"/>
+          <w:sz w:val="18"/>
         </w:rPr>
         <w:t xml:space="preserve"> Verified 3-tier plan selection (Free / Pro / Featured) and sandbox payment simulation.</w:t>
       </w:r>
@@ -1581,7 +1611,7 @@
         <w:rPr>
           <w:rFonts w:ascii="Segoe UI" w:hAnsi="Segoe UI"/>
           <w:color w:val="222222"/>
-          <w:sz w:val="19"/>
+          <w:sz w:val="18"/>
         </w:rPr>
         <w:t xml:space="preserve">[x] </w:t>
       </w:r>
@@ -1590,7 +1620,7 @@
           <w:rFonts w:ascii="Segoe UI" w:hAnsi="Segoe UI"/>
           <w:b/>
           <w:color w:val="222222"/>
-          <w:sz w:val="19"/>
+          <w:sz w:val="18"/>
         </w:rPr>
         <w:t>Documentation Compilation:</w:t>
       </w:r>
@@ -1598,14 +1628,14 @@
         <w:rPr>
           <w:rFonts w:ascii="Segoe UI" w:hAnsi="Segoe UI"/>
           <w:color w:val="222222"/>
-          <w:sz w:val="19"/>
+          <w:sz w:val="18"/>
         </w:rPr>
         <w:t xml:space="preserve"> Updated across Markdown and Microsoft Word DOCX formats with consistent credentials and architecture.</w:t>
       </w:r>
     </w:p>
     <w:sectPr>
       <w:pgSz w:w="12240" w:h="15840"/>
-      <w:pgMar w:top="1152" w:right="1296" w:bottom="1152" w:left="1296" w:header="720" w:footer="720" w:gutter="0"/>
+      <w:pgMar w:top="1152" w:right="1224" w:bottom="1152" w:left="1224" w:header="720" w:footer="720" w:gutter="0"/>
       <w:cols w:space="720"/>
       <w:docGrid w:linePitch="360"/>
     </w:sectPr>

</xml_diff>